<commit_message>
ba and plot tidyup
</commit_message>
<xml_diff>
--- a/results/10_iterations/canary/canaries_analysis_softimpute_updated.docx
+++ b/results/10_iterations/canary/canaries_analysis_softimpute_updated.docx
@@ -148,6 +148,7 @@
         </w:rPr>
         <w:t xml:space="preserve">Yielded </w:t>
       </w:r>
+      <w:proofErr w:type="gramStart"/>
       <w:r>
         <w:rPr>
           <w:rFonts w:ascii="David" w:hAnsi="David" w:cs="David"/>
@@ -160,7 +161,15 @@
           <w:rFonts w:ascii="David" w:hAnsi="David" w:cs="David"/>
           <w:lang w:val="en-US"/>
         </w:rPr>
-        <w:t xml:space="preserve"> very large csv </w:t>
+        <w:t xml:space="preserve"> very</w:t>
+      </w:r>
+      <w:proofErr w:type="gramEnd"/>
+      <w:r>
+        <w:rPr>
+          <w:rFonts w:ascii="David" w:hAnsi="David" w:cs="David"/>
+          <w:lang w:val="en-US"/>
+        </w:rPr>
+        <w:t xml:space="preserve"> large csv </w:t>
       </w:r>
       <w:proofErr w:type="gramStart"/>
       <w:r>
@@ -239,7 +248,23 @@
           <w:rFonts w:ascii="David" w:hAnsi="David" w:cs="David"/>
           <w:lang w:val="en-US"/>
         </w:rPr>
-        <w:t xml:space="preserve"> the amount of removed zeros i</w:t>
+        <w:t xml:space="preserve"> the amount of </w:t>
+      </w:r>
+      <w:proofErr w:type="gramStart"/>
+      <w:r>
+        <w:rPr>
+          <w:rFonts w:ascii="David" w:hAnsi="David" w:cs="David"/>
+          <w:lang w:val="en-US"/>
+        </w:rPr>
+        <w:t>removed zeros</w:t>
+      </w:r>
+      <w:proofErr w:type="gramEnd"/>
+      <w:r>
+        <w:rPr>
+          <w:rFonts w:ascii="David" w:hAnsi="David" w:cs="David"/>
+          <w:lang w:val="en-US"/>
+        </w:rPr>
+        <w:t xml:space="preserve"> i</w:t>
       </w:r>
       <w:r>
         <w:rPr>
@@ -799,7 +824,7 @@
         </w:rPr>
         <w:lastRenderedPageBreak/>
         <w:drawing>
-          <wp:inline distT="0" distB="0" distL="0" distR="0" wp14:anchorId="7018F8A3" wp14:editId="4C192581">
+          <wp:inline distT="0" distB="0" distL="0" distR="0" wp14:anchorId="7018F8A3" wp14:editId="3BB4DF31">
             <wp:extent cx="7277864" cy="3699644"/>
             <wp:effectExtent l="0" t="0" r="0" b="0"/>
             <wp:docPr id="946855315" name="Picture 2"/>
@@ -866,7 +891,7 @@
           <w:lang w:val="en-US"/>
         </w:rPr>
         <w:drawing>
-          <wp:inline distT="0" distB="0" distL="0" distR="0" wp14:anchorId="7CA25923" wp14:editId="3D67A45C">
+          <wp:inline distT="0" distB="0" distL="0" distR="0" wp14:anchorId="7CA25923" wp14:editId="6D5A4924">
             <wp:extent cx="7301012" cy="3711411"/>
             <wp:effectExtent l="0" t="0" r="0" b="3810"/>
             <wp:docPr id="1522771385" name="Picture 4"/>
@@ -4347,31 +4372,7 @@
           <w:rtl/>
           <w:lang w:val="en-US"/>
         </w:rPr>
-        <w:t xml:space="preserve">יש חשיבות לאילו לינקים מורידים. לכן טוב עשינו כשמיצענו </w:t>
-      </w:r>
-      <w:proofErr w:type="spellStart"/>
-      <w:r>
-        <w:rPr>
-          <w:rFonts w:ascii="David" w:hAnsi="David" w:cs="David" w:hint="cs"/>
-          <w:b/>
-          <w:bCs/>
-          <w:color w:val="7030A0"/>
-          <w:rtl/>
-          <w:lang w:val="en-US"/>
-        </w:rPr>
-        <w:t>איטרציות</w:t>
-      </w:r>
-      <w:proofErr w:type="spellEnd"/>
-      <w:r>
-        <w:rPr>
-          <w:rFonts w:ascii="David" w:hAnsi="David" w:cs="David" w:hint="cs"/>
-          <w:b/>
-          <w:bCs/>
-          <w:color w:val="7030A0"/>
-          <w:rtl/>
-          <w:lang w:val="en-US"/>
-        </w:rPr>
-        <w:t>.</w:t>
+        <w:t>יש חשיבות לאילו לינקים מורידים. לכן טוב עשינו כשמיצענו איטרציות.</w:t>
       </w:r>
     </w:p>
     <w:p>
@@ -5435,27 +5436,7 @@
           <w:rtl/>
           <w:lang w:val="en-US"/>
         </w:rPr>
-        <w:t xml:space="preserve"> בכל </w:t>
-      </w:r>
-      <w:proofErr w:type="spellStart"/>
-      <w:r>
-        <w:rPr>
-          <w:rFonts w:ascii="David" w:hAnsi="David" w:cs="David" w:hint="cs"/>
-          <w:color w:val="FF0000"/>
-          <w:rtl/>
-          <w:lang w:val="en-US"/>
-        </w:rPr>
-        <w:t>הפלוטים</w:t>
-      </w:r>
-      <w:proofErr w:type="spellEnd"/>
-      <w:r>
-        <w:rPr>
-          <w:rFonts w:ascii="David" w:hAnsi="David" w:cs="David" w:hint="cs"/>
-          <w:color w:val="FF0000"/>
-          <w:rtl/>
-          <w:lang w:val="en-US"/>
-        </w:rPr>
-        <w:t xml:space="preserve"> ומספר ספרות. להוסיף שנתות.</w:t>
+        <w:t xml:space="preserve"> בכל הפלוטים ומספר ספרות. להוסיף שנתות.</w:t>
       </w:r>
     </w:p>
     <w:p>
@@ -6565,7 +6546,25 @@
           <w:color w:val="000000" w:themeColor="text1"/>
           <w:lang w:val="en-US"/>
         </w:rPr>
-        <w:t>, when looking at 1 iteration the trends are the same but not significant</w:t>
+        <w:t xml:space="preserve">, when looking at 1 </w:t>
+      </w:r>
+      <w:proofErr w:type="gramStart"/>
+      <w:r>
+        <w:rPr>
+          <w:rFonts w:ascii="David" w:hAnsi="David" w:cs="David"/>
+          <w:color w:val="000000" w:themeColor="text1"/>
+          <w:lang w:val="en-US"/>
+        </w:rPr>
+        <w:t>iteration</w:t>
+      </w:r>
+      <w:proofErr w:type="gramEnd"/>
+      <w:r>
+        <w:rPr>
+          <w:rFonts w:ascii="David" w:hAnsi="David" w:cs="David"/>
+          <w:color w:val="000000" w:themeColor="text1"/>
+          <w:lang w:val="en-US"/>
+        </w:rPr>
+        <w:t xml:space="preserve"> the trends are the same but not significant</w:t>
       </w:r>
       <w:r>
         <w:rPr>
@@ -7279,31 +7278,7 @@
           <w:rtl/>
           <w:lang w:val="en-US"/>
         </w:rPr>
-        <w:t xml:space="preserve">צריך לסנן רק את המינים שנחזו כאפס </w:t>
-      </w:r>
-      <w:proofErr w:type="spellStart"/>
-      <w:r>
-        <w:rPr>
-          <w:rFonts w:ascii="David" w:hAnsi="David" w:cs="David" w:hint="cs"/>
-          <w:b/>
-          <w:bCs/>
-          <w:color w:val="FF0000"/>
-          <w:rtl/>
-          <w:lang w:val="en-US"/>
-        </w:rPr>
-        <w:t>בכללל</w:t>
-      </w:r>
-      <w:proofErr w:type="spellEnd"/>
-      <w:r>
-        <w:rPr>
-          <w:rFonts w:ascii="David" w:hAnsi="David" w:cs="David" w:hint="cs"/>
-          <w:b/>
-          <w:bCs/>
-          <w:color w:val="FF0000"/>
-          <w:rtl/>
-          <w:lang w:val="en-US"/>
-        </w:rPr>
-        <w:t xml:space="preserve"> האיים</w:t>
+        <w:t>צריך לסנן רק את המינים שנחזו כאפס בכללל האיים</w:t>
       </w:r>
     </w:p>
     <w:p>
@@ -10448,9 +10423,18 @@
           <w:color w:val="7030A0"/>
           <w:rtl/>
         </w:rPr>
-        <w:t xml:space="preserve">לא נכון להשתמש פה ברגרסיה לינארית כי יש חיזוי מאי 1 ל-2 ו-1 ל-3 </w:t>
-      </w:r>
-      <w:proofErr w:type="spellStart"/>
+        <w:t>לא נכון להשתמש פה ברגרסיה לינארית כי יש חיזוי מאי 1 ל-2 ו-1 ל-3 וכו׳, לכן עדיף להשתמש במה שיצא מה-</w:t>
+      </w:r>
+      <w:r>
+        <w:rPr>
+          <w:rFonts w:ascii="David" w:hAnsi="David" w:cs="David"/>
+          <w:b/>
+          <w:bCs/>
+          <w:color w:val="7030A0"/>
+          <w:lang w:val="en-US"/>
+        </w:rPr>
+        <w:t>rf</w:t>
+      </w:r>
       <w:r>
         <w:rPr>
           <w:rFonts w:ascii="David" w:hAnsi="David" w:cs="David" w:hint="cs"/>
@@ -10458,37 +10442,6 @@
           <w:bCs/>
           <w:color w:val="7030A0"/>
           <w:rtl/>
-        </w:rPr>
-        <w:t>וכו</w:t>
-      </w:r>
-      <w:proofErr w:type="spellEnd"/>
-      <w:r>
-        <w:rPr>
-          <w:rFonts w:ascii="David" w:hAnsi="David" w:cs="David" w:hint="cs"/>
-          <w:b/>
-          <w:bCs/>
-          <w:color w:val="7030A0"/>
-          <w:rtl/>
-        </w:rPr>
-        <w:t>׳, לכן עדיף להשתמש במה שיצא מה-</w:t>
-      </w:r>
-      <w:r>
-        <w:rPr>
-          <w:rFonts w:ascii="David" w:hAnsi="David" w:cs="David"/>
-          <w:b/>
-          <w:bCs/>
-          <w:color w:val="7030A0"/>
-          <w:lang w:val="en-US"/>
-        </w:rPr>
-        <w:t>rf</w:t>
-      </w:r>
-      <w:r>
-        <w:rPr>
-          <w:rFonts w:ascii="David" w:hAnsi="David" w:cs="David" w:hint="cs"/>
-          <w:b/>
-          <w:bCs/>
-          <w:color w:val="7030A0"/>
-          <w:rtl/>
           <w:lang w:val="en-US"/>
         </w:rPr>
         <w:t>.</w:t>
@@ -10552,9 +10505,9 @@
           <w:color w:val="000000" w:themeColor="text1"/>
         </w:rPr>
         <w:drawing>
-          <wp:inline distT="0" distB="0" distL="0" distR="0" wp14:anchorId="532377A6" wp14:editId="4630873B">
-            <wp:extent cx="4126230" cy="3192425"/>
-            <wp:effectExtent l="0" t="0" r="7620" b="8255"/>
+          <wp:inline distT="0" distB="0" distL="0" distR="0" wp14:anchorId="532377A6" wp14:editId="15248612">
+            <wp:extent cx="2916000" cy="2256077"/>
+            <wp:effectExtent l="0" t="0" r="0" b="0"/>
             <wp:docPr id="1733097654" name="Picture 3"/>
             <wp:cNvGraphicFramePr>
               <a:graphicFrameLocks xmlns:a="http://schemas.openxmlformats.org/drawingml/2006/main" noChangeAspect="1"/>
@@ -10567,7 +10520,7 @@
                     <pic:cNvPicPr/>
                   </pic:nvPicPr>
                   <pic:blipFill rotWithShape="1">
-                    <a:blip r:embed="rId49">
+                    <a:blip r:embed="rId49" cstate="print">
                       <a:extLst>
                         <a:ext uri="{28A0092B-C50C-407E-A947-70E740481C1C}">
                           <a14:useLocalDpi xmlns:a14="http://schemas.microsoft.com/office/drawing/2010/main" val="0"/>
@@ -10580,7 +10533,7 @@
                   <pic:spPr bwMode="auto">
                     <a:xfrm>
                       <a:off x="0" y="0"/>
-                      <a:ext cx="4126477" cy="3192616"/>
+                      <a:ext cx="2916000" cy="2256077"/>
                     </a:xfrm>
                     <a:prstGeom prst="rect">
                       <a:avLst/>
@@ -10600,6 +10553,54 @@
           </wp:inline>
         </w:drawing>
       </w:r>
+      <w:r>
+        <w:rPr>
+          <w:rFonts w:ascii="David" w:hAnsi="David" w:cs="David"/>
+          <w:noProof/>
+          <w:color w:val="000000" w:themeColor="text1"/>
+        </w:rPr>
+        <w:drawing>
+          <wp:inline distT="0" distB="0" distL="0" distR="0" wp14:anchorId="6DC354B3" wp14:editId="0E02853C">
+            <wp:extent cx="2736000" cy="2309830"/>
+            <wp:effectExtent l="0" t="0" r="7620" b="0"/>
+            <wp:docPr id="1657564355" name="Picture 1"/>
+            <wp:cNvGraphicFramePr>
+              <a:graphicFrameLocks xmlns:a="http://schemas.openxmlformats.org/drawingml/2006/main" noChangeAspect="1"/>
+            </wp:cNvGraphicFramePr>
+            <a:graphic xmlns:a="http://schemas.openxmlformats.org/drawingml/2006/main">
+              <a:graphicData uri="http://schemas.openxmlformats.org/drawingml/2006/picture">
+                <pic:pic xmlns:pic="http://schemas.openxmlformats.org/drawingml/2006/picture">
+                  <pic:nvPicPr>
+                    <pic:cNvPr id="1657564355" name="Picture 1657564355"/>
+                    <pic:cNvPicPr/>
+                  </pic:nvPicPr>
+                  <pic:blipFill>
+                    <a:blip r:embed="rId50" cstate="print">
+                      <a:extLst>
+                        <a:ext uri="{28A0092B-C50C-407E-A947-70E740481C1C}">
+                          <a14:useLocalDpi xmlns:a14="http://schemas.microsoft.com/office/drawing/2010/main" val="0"/>
+                        </a:ext>
+                      </a:extLst>
+                    </a:blip>
+                    <a:stretch>
+                      <a:fillRect/>
+                    </a:stretch>
+                  </pic:blipFill>
+                  <pic:spPr>
+                    <a:xfrm>
+                      <a:off x="0" y="0"/>
+                      <a:ext cx="2736000" cy="2309830"/>
+                    </a:xfrm>
+                    <a:prstGeom prst="rect">
+                      <a:avLst/>
+                    </a:prstGeom>
+                  </pic:spPr>
+                </pic:pic>
+              </a:graphicData>
+            </a:graphic>
+          </wp:inline>
+        </w:drawing>
+      </w:r>
     </w:p>
     <w:p>
       <w:pPr>
@@ -10631,7 +10632,7 @@
         </w:rPr>
         <w:lastRenderedPageBreak/>
         <w:drawing>
-          <wp:inline distT="0" distB="0" distL="0" distR="0" wp14:anchorId="05472C01" wp14:editId="22E5E483">
+          <wp:inline distT="0" distB="0" distL="0" distR="0" wp14:anchorId="05472C01" wp14:editId="5F5C273D">
             <wp:extent cx="4543865" cy="3841411"/>
             <wp:effectExtent l="0" t="0" r="9525" b="6985"/>
             <wp:docPr id="299472941" name="Picture 4"/>
@@ -10646,7 +10647,7 @@
                     <pic:cNvPicPr/>
                   </pic:nvPicPr>
                   <pic:blipFill>
-                    <a:blip r:embed="rId50" cstate="print">
+                    <a:blip r:embed="rId51" cstate="print">
                       <a:extLst>
                         <a:ext uri="{28A0092B-C50C-407E-A947-70E740481C1C}">
                           <a14:useLocalDpi xmlns:a14="http://schemas.microsoft.com/office/drawing/2010/main" val="0"/>
@@ -10729,7 +10730,6 @@
           <w:lang w:val="en-US"/>
         </w:rPr>
       </w:pPr>
-      <w:proofErr w:type="spellStart"/>
       <w:r>
         <w:rPr>
           <w:rFonts w:ascii="David" w:hAnsi="David" w:cs="David" w:hint="cs"/>
@@ -10739,19 +10739,7 @@
           <w:rtl/>
           <w:lang w:val="en-US"/>
         </w:rPr>
-        <w:t>אגרגציה</w:t>
-      </w:r>
-      <w:proofErr w:type="spellEnd"/>
-      <w:r>
-        <w:rPr>
-          <w:rFonts w:ascii="David" w:hAnsi="David" w:cs="David" w:hint="cs"/>
-          <w:b/>
-          <w:bCs/>
-          <w:color w:val="7030A0"/>
-          <w:rtl/>
-          <w:lang w:val="en-US"/>
-        </w:rPr>
-        <w:t xml:space="preserve"> משפרת את התחזיות</w:t>
+        <w:t>אגרגציה משפרת את התחזיות</w:t>
       </w:r>
       <w:r>
         <w:rPr>

</xml_diff>